<commit_message>
Update customers email buyer to include buyer2 + item description search
</commit_message>
<xml_diff>
--- a/Tasks to make ET Products Internal Portal Functional.docx
+++ b/Tasks to make ET Products Internal Portal Functional.docx
@@ -74,7 +74,23 @@
           <w:szCs w:val="20"/>
         </w:rPr>
         <w:br/>
-        <w:t xml:space="preserve">      a. Exports all accounts from SAGE (21 fields)</w:t>
+        <w:t xml:space="preserve">      a. </w:t>
+      </w:r>
+      <w:proofErr w:type="gramStart"/>
+      <w:r>
+        <w:rPr>
+          <w:sz w:val="20"/>
+          <w:szCs w:val="20"/>
+        </w:rPr>
+        <w:t>Exports</w:t>
+      </w:r>
+      <w:proofErr w:type="gramEnd"/>
+      <w:r>
+        <w:rPr>
+          <w:sz w:val="20"/>
+          <w:szCs w:val="20"/>
+        </w:rPr>
+        <w:t xml:space="preserve"> all accounts from SAGE (21 fields)</w:t>
       </w:r>
     </w:p>
     <w:p>
@@ -91,53 +107,114 @@
         </w:rPr>
         <w:t>2</w:t>
       </w:r>
-      <w:r>
-        <w:rPr>
-          <w:sz w:val="20"/>
-          <w:szCs w:val="20"/>
-        </w:rPr>
-        <w:t>.  SALES_CUST_CON</w:t>
-      </w:r>
-      <w:r>
-        <w:rPr>
-          <w:sz w:val="20"/>
-          <w:szCs w:val="20"/>
-        </w:rPr>
-        <w:br/>
-        <w:t xml:space="preserve">      a. Exports any buyers customers from Sage.</w:t>
-      </w:r>
-      <w:r>
-        <w:rPr>
-          <w:sz w:val="20"/>
-          <w:szCs w:val="20"/>
-        </w:rPr>
-        <w:br/>
-        <w:t xml:space="preserve">           1. CustomerNo</w:t>
-      </w:r>
-      <w:r>
-        <w:rPr>
-          <w:sz w:val="20"/>
-          <w:szCs w:val="20"/>
-        </w:rPr>
-        <w:br/>
-        <w:t xml:space="preserve">           2. ContactCode</w:t>
-      </w:r>
-      <w:r>
-        <w:rPr>
-          <w:sz w:val="20"/>
-          <w:szCs w:val="20"/>
-        </w:rPr>
-        <w:br/>
-        <w:t xml:space="preserve">           3. ContactName</w:t>
-      </w:r>
-      <w:r>
-        <w:rPr>
-          <w:sz w:val="20"/>
-          <w:szCs w:val="20"/>
-        </w:rPr>
-        <w:br/>
-        <w:t xml:space="preserve">           4.  EmailAddress</w:t>
-      </w:r>
+      <w:proofErr w:type="gramStart"/>
+      <w:r>
+        <w:rPr>
+          <w:sz w:val="20"/>
+          <w:szCs w:val="20"/>
+        </w:rPr>
+        <w:t>.  SALES</w:t>
+      </w:r>
+      <w:proofErr w:type="gramEnd"/>
+      <w:r>
+        <w:rPr>
+          <w:sz w:val="20"/>
+          <w:szCs w:val="20"/>
+        </w:rPr>
+        <w:t>_CUST_CON</w:t>
+      </w:r>
+      <w:r>
+        <w:rPr>
+          <w:sz w:val="20"/>
+          <w:szCs w:val="20"/>
+        </w:rPr>
+        <w:br/>
+        <w:t xml:space="preserve">      a. Exports any </w:t>
+      </w:r>
+      <w:proofErr w:type="gramStart"/>
+      <w:r>
+        <w:rPr>
+          <w:sz w:val="20"/>
+          <w:szCs w:val="20"/>
+        </w:rPr>
+        <w:t>buyers</w:t>
+      </w:r>
+      <w:proofErr w:type="gramEnd"/>
+      <w:r>
+        <w:rPr>
+          <w:sz w:val="20"/>
+          <w:szCs w:val="20"/>
+        </w:rPr>
+        <w:t xml:space="preserve"> customers from Sage.</w:t>
+      </w:r>
+      <w:r>
+        <w:rPr>
+          <w:sz w:val="20"/>
+          <w:szCs w:val="20"/>
+        </w:rPr>
+        <w:br/>
+        <w:t xml:space="preserve">           1. </w:t>
+      </w:r>
+      <w:proofErr w:type="spellStart"/>
+      <w:r>
+        <w:rPr>
+          <w:sz w:val="20"/>
+          <w:szCs w:val="20"/>
+        </w:rPr>
+        <w:t>CustomerNo</w:t>
+      </w:r>
+      <w:proofErr w:type="spellEnd"/>
+      <w:r>
+        <w:rPr>
+          <w:sz w:val="20"/>
+          <w:szCs w:val="20"/>
+        </w:rPr>
+        <w:br/>
+        <w:t xml:space="preserve">           2. </w:t>
+      </w:r>
+      <w:proofErr w:type="spellStart"/>
+      <w:r>
+        <w:rPr>
+          <w:sz w:val="20"/>
+          <w:szCs w:val="20"/>
+        </w:rPr>
+        <w:t>ContactCode</w:t>
+      </w:r>
+      <w:proofErr w:type="spellEnd"/>
+      <w:r>
+        <w:rPr>
+          <w:sz w:val="20"/>
+          <w:szCs w:val="20"/>
+        </w:rPr>
+        <w:br/>
+        <w:t xml:space="preserve">           3. </w:t>
+      </w:r>
+      <w:proofErr w:type="spellStart"/>
+      <w:r>
+        <w:rPr>
+          <w:sz w:val="20"/>
+          <w:szCs w:val="20"/>
+        </w:rPr>
+        <w:t>ContactName</w:t>
+      </w:r>
+      <w:proofErr w:type="spellEnd"/>
+      <w:r>
+        <w:rPr>
+          <w:sz w:val="20"/>
+          <w:szCs w:val="20"/>
+        </w:rPr>
+        <w:br/>
+        <w:t xml:space="preserve">           4.  </w:t>
+      </w:r>
+      <w:proofErr w:type="spellStart"/>
+      <w:r>
+        <w:rPr>
+          <w:sz w:val="20"/>
+          <w:szCs w:val="20"/>
+        </w:rPr>
+        <w:t>EmailAddress</w:t>
+      </w:r>
+      <w:proofErr w:type="spellEnd"/>
       <w:r>
         <w:rPr>
           <w:sz w:val="20"/>
@@ -195,7 +272,23 @@
           <w:szCs w:val="20"/>
         </w:rPr>
         <w:br/>
-        <w:t xml:space="preserve">     a. Exports all invoice detail from Sage</w:t>
+        <w:t xml:space="preserve">     a. Exports all invoice </w:t>
+      </w:r>
+      <w:proofErr w:type="gramStart"/>
+      <w:r>
+        <w:rPr>
+          <w:sz w:val="20"/>
+          <w:szCs w:val="20"/>
+        </w:rPr>
+        <w:t>detail</w:t>
+      </w:r>
+      <w:proofErr w:type="gramEnd"/>
+      <w:r>
+        <w:rPr>
+          <w:sz w:val="20"/>
+          <w:szCs w:val="20"/>
+        </w:rPr>
+        <w:t xml:space="preserve"> from Sage</w:t>
       </w:r>
       <w:r>
         <w:rPr>
@@ -205,6 +298,7 @@
         <w:br/>
         <w:t xml:space="preserve">           1. </w:t>
       </w:r>
+      <w:proofErr w:type="spellStart"/>
       <w:r>
         <w:rPr>
           <w:sz w:val="20"/>
@@ -212,6 +306,7 @@
         </w:rPr>
         <w:t>InvoiceNo</w:t>
       </w:r>
+      <w:proofErr w:type="spellEnd"/>
       <w:r>
         <w:rPr>
           <w:sz w:val="20"/>
@@ -220,6 +315,7 @@
         <w:br/>
         <w:t xml:space="preserve">           2. </w:t>
       </w:r>
+      <w:proofErr w:type="spellStart"/>
       <w:r>
         <w:rPr>
           <w:sz w:val="20"/>
@@ -227,6 +323,7 @@
         </w:rPr>
         <w:t>ItemCode</w:t>
       </w:r>
+      <w:proofErr w:type="spellEnd"/>
       <w:r>
         <w:rPr>
           <w:sz w:val="20"/>
@@ -235,6 +332,7 @@
         <w:br/>
         <w:t xml:space="preserve">           3. </w:t>
       </w:r>
+      <w:proofErr w:type="spellStart"/>
       <w:r>
         <w:rPr>
           <w:sz w:val="20"/>
@@ -242,6 +340,7 @@
         </w:rPr>
         <w:t>ItemCodeDesc</w:t>
       </w:r>
+      <w:proofErr w:type="spellEnd"/>
       <w:r>
         <w:rPr>
           <w:sz w:val="20"/>
@@ -250,6 +349,7 @@
         <w:br/>
         <w:t xml:space="preserve">           4. </w:t>
       </w:r>
+      <w:proofErr w:type="spellStart"/>
       <w:r>
         <w:rPr>
           <w:sz w:val="20"/>
@@ -257,6 +357,7 @@
         </w:rPr>
         <w:t>QuantityShiped</w:t>
       </w:r>
+      <w:proofErr w:type="spellEnd"/>
       <w:r>
         <w:rPr>
           <w:sz w:val="20"/>
@@ -280,6 +381,7 @@
         <w:br/>
         <w:t xml:space="preserve">           6. </w:t>
       </w:r>
+      <w:proofErr w:type="spellStart"/>
       <w:r>
         <w:rPr>
           <w:sz w:val="20"/>
@@ -287,6 +389,7 @@
         </w:rPr>
         <w:t>ProductLine</w:t>
       </w:r>
+      <w:proofErr w:type="spellEnd"/>
       <w:r>
         <w:rPr>
           <w:sz w:val="20"/>
@@ -295,6 +398,7 @@
         <w:br/>
         <w:t xml:space="preserve">           7. </w:t>
       </w:r>
+      <w:proofErr w:type="spellStart"/>
       <w:r>
         <w:rPr>
           <w:sz w:val="20"/>
@@ -302,6 +406,7 @@
         </w:rPr>
         <w:t>AliasItemNo</w:t>
       </w:r>
+      <w:proofErr w:type="spellEnd"/>
       <w:r>
         <w:rPr>
           <w:sz w:val="20"/>
@@ -315,8 +420,17 @@
           <w:sz w:val="20"/>
           <w:szCs w:val="20"/>
         </w:rPr>
-        <w:t xml:space="preserve"> CommentText</w:t>
-      </w:r>
+        <w:t xml:space="preserve"> </w:t>
+      </w:r>
+      <w:proofErr w:type="spellStart"/>
+      <w:r>
+        <w:rPr>
+          <w:sz w:val="20"/>
+          <w:szCs w:val="20"/>
+        </w:rPr>
+        <w:t>CommentText</w:t>
+      </w:r>
+      <w:proofErr w:type="spellEnd"/>
       <w:r>
         <w:rPr>
           <w:sz w:val="20"/>
@@ -325,6 +439,7 @@
         <w:br/>
         <w:t xml:space="preserve">           9. </w:t>
       </w:r>
+      <w:proofErr w:type="spellStart"/>
       <w:r>
         <w:rPr>
           <w:sz w:val="20"/>
@@ -332,6 +447,7 @@
         </w:rPr>
         <w:t>UnitPrice</w:t>
       </w:r>
+      <w:proofErr w:type="spellEnd"/>
       <w:r>
         <w:rPr>
           <w:sz w:val="20"/>
@@ -340,6 +456,7 @@
         <w:br/>
         <w:t xml:space="preserve">           10. </w:t>
       </w:r>
+      <w:proofErr w:type="spellStart"/>
       <w:r>
         <w:rPr>
           <w:sz w:val="20"/>
@@ -347,6 +464,7 @@
         </w:rPr>
         <w:t>ExtensionAmt</w:t>
       </w:r>
+      <w:proofErr w:type="spellEnd"/>
       <w:r>
         <w:rPr>
           <w:sz w:val="20"/>
@@ -355,6 +473,7 @@
         <w:br/>
         <w:t xml:space="preserve">           11. </w:t>
       </w:r>
+      <w:proofErr w:type="spellStart"/>
       <w:r>
         <w:rPr>
           <w:sz w:val="20"/>
@@ -362,6 +481,7 @@
         </w:rPr>
         <w:t>WarehouseCode</w:t>
       </w:r>
+      <w:proofErr w:type="spellEnd"/>
       <w:r>
         <w:rPr>
           <w:sz w:val="20"/>
@@ -370,6 +490,7 @@
         <w:br/>
         <w:t xml:space="preserve">           12. </w:t>
       </w:r>
+      <w:proofErr w:type="spellStart"/>
       <w:r>
         <w:rPr>
           <w:sz w:val="20"/>
@@ -377,6 +498,7 @@
         </w:rPr>
         <w:t>SalesAcctKey</w:t>
       </w:r>
+      <w:proofErr w:type="spellEnd"/>
       <w:r>
         <w:rPr>
           <w:sz w:val="20"/>
@@ -413,16 +535,34 @@
           <w:szCs w:val="20"/>
         </w:rPr>
         <w:br/>
-        <w:t xml:space="preserve">           1. SalesOderNo</w:t>
-      </w:r>
-      <w:r>
-        <w:rPr>
-          <w:sz w:val="20"/>
-          <w:szCs w:val="20"/>
-        </w:rPr>
-        <w:br/>
-        <w:t xml:space="preserve">           2. OrderDate</w:t>
-      </w:r>
+        <w:t xml:space="preserve">           1. </w:t>
+      </w:r>
+      <w:proofErr w:type="spellStart"/>
+      <w:r>
+        <w:rPr>
+          <w:sz w:val="20"/>
+          <w:szCs w:val="20"/>
+        </w:rPr>
+        <w:t>SalesOderNo</w:t>
+      </w:r>
+      <w:proofErr w:type="spellEnd"/>
+      <w:r>
+        <w:rPr>
+          <w:sz w:val="20"/>
+          <w:szCs w:val="20"/>
+        </w:rPr>
+        <w:br/>
+        <w:t xml:space="preserve">           2. </w:t>
+      </w:r>
+      <w:proofErr w:type="spellStart"/>
+      <w:r>
+        <w:rPr>
+          <w:sz w:val="20"/>
+          <w:szCs w:val="20"/>
+        </w:rPr>
+        <w:t>OrderDate</w:t>
+      </w:r>
+      <w:proofErr w:type="spellEnd"/>
       <w:r>
         <w:rPr>
           <w:sz w:val="20"/>
@@ -437,24 +577,51 @@
           <w:szCs w:val="20"/>
         </w:rPr>
         <w:br/>
-        <w:t xml:space="preserve">           4. SalespersonNo</w:t>
-      </w:r>
-      <w:r>
-        <w:rPr>
-          <w:sz w:val="20"/>
-          <w:szCs w:val="20"/>
-        </w:rPr>
-        <w:br/>
-        <w:t xml:space="preserve">           5. CustomerNo</w:t>
-      </w:r>
-      <w:r>
-        <w:rPr>
-          <w:sz w:val="20"/>
-          <w:szCs w:val="20"/>
-        </w:rPr>
-        <w:br/>
-        <w:t xml:space="preserve">           6. ShipToName</w:t>
-      </w:r>
+        <w:t xml:space="preserve">           4. </w:t>
+      </w:r>
+      <w:proofErr w:type="spellStart"/>
+      <w:r>
+        <w:rPr>
+          <w:sz w:val="20"/>
+          <w:szCs w:val="20"/>
+        </w:rPr>
+        <w:t>SalespersonNo</w:t>
+      </w:r>
+      <w:proofErr w:type="spellEnd"/>
+      <w:r>
+        <w:rPr>
+          <w:sz w:val="20"/>
+          <w:szCs w:val="20"/>
+        </w:rPr>
+        <w:br/>
+        <w:t xml:space="preserve">           5. </w:t>
+      </w:r>
+      <w:proofErr w:type="spellStart"/>
+      <w:r>
+        <w:rPr>
+          <w:sz w:val="20"/>
+          <w:szCs w:val="20"/>
+        </w:rPr>
+        <w:t>CustomerNo</w:t>
+      </w:r>
+      <w:proofErr w:type="spellEnd"/>
+      <w:r>
+        <w:rPr>
+          <w:sz w:val="20"/>
+          <w:szCs w:val="20"/>
+        </w:rPr>
+        <w:br/>
+        <w:t xml:space="preserve">           6. </w:t>
+      </w:r>
+      <w:proofErr w:type="spellStart"/>
+      <w:r>
+        <w:rPr>
+          <w:sz w:val="20"/>
+          <w:szCs w:val="20"/>
+        </w:rPr>
+        <w:t>ShipToName</w:t>
+      </w:r>
+      <w:proofErr w:type="spellEnd"/>
       <w:r>
         <w:rPr>
           <w:sz w:val="20"/>
@@ -469,52 +636,155 @@
           <w:szCs w:val="20"/>
         </w:rPr>
         <w:br/>
-        <w:t xml:space="preserve">           8. ShipToCity</w:t>
-      </w:r>
-      <w:r>
-        <w:rPr>
-          <w:sz w:val="20"/>
-          <w:szCs w:val="20"/>
-        </w:rPr>
-        <w:br/>
-        <w:t xml:space="preserve">           9. ShipToState</w:t>
-      </w:r>
-      <w:r>
-        <w:rPr>
-          <w:sz w:val="20"/>
-          <w:szCs w:val="20"/>
-        </w:rPr>
-        <w:br/>
-        <w:t xml:space="preserve">           10. ShipToZipCode</w:t>
-      </w:r>
-      <w:r>
-        <w:rPr>
-          <w:sz w:val="20"/>
-          <w:szCs w:val="20"/>
-        </w:rPr>
-        <w:br/>
-        <w:t xml:space="preserve">           11. ItemCode</w:t>
-      </w:r>
-      <w:r>
-        <w:rPr>
-          <w:sz w:val="20"/>
-          <w:szCs w:val="20"/>
-        </w:rPr>
-        <w:br/>
-        <w:t xml:space="preserve">           12. ItemCodeDesc</w:t>
-      </w:r>
-      <w:r>
-        <w:rPr>
-          <w:sz w:val="20"/>
-          <w:szCs w:val="20"/>
-        </w:rPr>
-        <w:br/>
-        <w:t xml:space="preserve">           13. QuantityOrdered</w:t>
-      </w:r>
+        <w:t xml:space="preserve">           8. </w:t>
+      </w:r>
+      <w:proofErr w:type="spellStart"/>
+      <w:r>
+        <w:rPr>
+          <w:sz w:val="20"/>
+          <w:szCs w:val="20"/>
+        </w:rPr>
+        <w:t>ShipToCity</w:t>
+      </w:r>
+      <w:proofErr w:type="spellEnd"/>
+      <w:r>
+        <w:rPr>
+          <w:sz w:val="20"/>
+          <w:szCs w:val="20"/>
+        </w:rPr>
+        <w:br/>
+        <w:t xml:space="preserve">           9. </w:t>
+      </w:r>
+      <w:proofErr w:type="spellStart"/>
+      <w:r>
+        <w:rPr>
+          <w:sz w:val="20"/>
+          <w:szCs w:val="20"/>
+        </w:rPr>
+        <w:t>ShipToState</w:t>
+      </w:r>
+      <w:proofErr w:type="spellEnd"/>
+      <w:r>
+        <w:rPr>
+          <w:sz w:val="20"/>
+          <w:szCs w:val="20"/>
+        </w:rPr>
+        <w:br/>
+        <w:t xml:space="preserve">           10. </w:t>
+      </w:r>
+      <w:proofErr w:type="spellStart"/>
+      <w:r>
+        <w:rPr>
+          <w:sz w:val="20"/>
+          <w:szCs w:val="20"/>
+        </w:rPr>
+        <w:t>ShipToZipCode</w:t>
+      </w:r>
+      <w:proofErr w:type="spellEnd"/>
+      <w:r>
+        <w:rPr>
+          <w:sz w:val="20"/>
+          <w:szCs w:val="20"/>
+        </w:rPr>
+        <w:br/>
+        <w:t xml:space="preserve">           11. </w:t>
+      </w:r>
+      <w:proofErr w:type="spellStart"/>
+      <w:r>
+        <w:rPr>
+          <w:sz w:val="20"/>
+          <w:szCs w:val="20"/>
+        </w:rPr>
+        <w:t>ItemCode</w:t>
+      </w:r>
+      <w:proofErr w:type="spellEnd"/>
+      <w:r>
+        <w:rPr>
+          <w:sz w:val="20"/>
+          <w:szCs w:val="20"/>
+        </w:rPr>
+        <w:br/>
+        <w:t xml:space="preserve">           12. </w:t>
+      </w:r>
+      <w:proofErr w:type="spellStart"/>
+      <w:r>
+        <w:rPr>
+          <w:sz w:val="20"/>
+          <w:szCs w:val="20"/>
+        </w:rPr>
+        <w:t>ItemCodeDesc</w:t>
+      </w:r>
+      <w:proofErr w:type="spellEnd"/>
+      <w:r>
+        <w:rPr>
+          <w:sz w:val="20"/>
+          <w:szCs w:val="20"/>
+        </w:rPr>
+        <w:br/>
+        <w:t xml:space="preserve">           13. </w:t>
+      </w:r>
+      <w:proofErr w:type="spellStart"/>
+      <w:r>
+        <w:rPr>
+          <w:sz w:val="20"/>
+          <w:szCs w:val="20"/>
+        </w:rPr>
+        <w:t>QuantityOrdered</w:t>
+      </w:r>
+      <w:proofErr w:type="spellEnd"/>
     </w:p>
     <w:p>
       <w:pPr>
         <w:rPr>
+          <w:sz w:val="20"/>
+          <w:szCs w:val="20"/>
+        </w:rPr>
+      </w:pPr>
+      <w:r>
+        <w:rPr>
+          <w:sz w:val="20"/>
+          <w:szCs w:val="20"/>
+        </w:rPr>
+        <w:lastRenderedPageBreak/>
+        <w:t xml:space="preserve">6. </w:t>
+      </w:r>
+      <w:proofErr w:type="spellStart"/>
+      <w:r>
+        <w:rPr>
+          <w:sz w:val="20"/>
+          <w:szCs w:val="20"/>
+        </w:rPr>
+        <w:t>SALES_Item</w:t>
+      </w:r>
+      <w:proofErr w:type="spellEnd"/>
+      <w:r>
+        <w:rPr>
+          <w:sz w:val="20"/>
+          <w:szCs w:val="20"/>
+        </w:rPr>
+        <w:br/>
+        <w:t xml:space="preserve">    a. </w:t>
+      </w:r>
+      <w:proofErr w:type="gramStart"/>
+      <w:r>
+        <w:rPr>
+          <w:sz w:val="20"/>
+          <w:szCs w:val="20"/>
+        </w:rPr>
+        <w:t>Exports</w:t>
+      </w:r>
+      <w:proofErr w:type="gramEnd"/>
+      <w:r>
+        <w:rPr>
+          <w:sz w:val="20"/>
+          <w:szCs w:val="20"/>
+        </w:rPr>
+        <w:t xml:space="preserve"> all items </w:t>
+      </w:r>
+    </w:p>
+    <w:p>
+      <w:pPr>
+        <w:rPr>
           <w:b/>
           <w:bCs/>
           <w:sz w:val="20"/>
@@ -530,9 +800,20 @@
           <w:szCs w:val="20"/>
           <w:u w:val="single"/>
         </w:rPr>
-        <w:lastRenderedPageBreak/>
-        <w:t>Scripts that need ran</w:t>
-      </w:r>
+        <w:t xml:space="preserve">Scripts that need </w:t>
+      </w:r>
+      <w:proofErr w:type="gramStart"/>
+      <w:r>
+        <w:rPr>
+          <w:b/>
+          <w:bCs/>
+          <w:sz w:val="20"/>
+          <w:szCs w:val="20"/>
+          <w:u w:val="single"/>
+        </w:rPr>
+        <w:t>ran</w:t>
+      </w:r>
+      <w:proofErr w:type="gramEnd"/>
     </w:p>
     <w:p>
       <w:pPr>
@@ -595,12 +876,21 @@
           <w:szCs w:val="20"/>
         </w:rPr>
       </w:pPr>
-      <w:r>
-        <w:rPr>
-          <w:sz w:val="20"/>
-          <w:szCs w:val="20"/>
-        </w:rPr>
-        <w:t>Imports last three years of invoices from IHH</w:t>
+      <w:proofErr w:type="gramStart"/>
+      <w:r>
+        <w:rPr>
+          <w:sz w:val="20"/>
+          <w:szCs w:val="20"/>
+        </w:rPr>
+        <w:t>Imports</w:t>
+      </w:r>
+      <w:proofErr w:type="gramEnd"/>
+      <w:r>
+        <w:rPr>
+          <w:sz w:val="20"/>
+          <w:szCs w:val="20"/>
+        </w:rPr>
+        <w:t xml:space="preserve"> last three years of invoices from IHH</w:t>
       </w:r>
     </w:p>
     <w:p>
@@ -635,6 +925,7 @@
           <w:szCs w:val="20"/>
         </w:rPr>
       </w:pPr>
+      <w:proofErr w:type="spellStart"/>
       <w:r>
         <w:rPr>
           <w:sz w:val="20"/>
@@ -649,6 +940,7 @@
         </w:rPr>
         <w:t>ackfill_line_headers.mjs</w:t>
       </w:r>
+      <w:proofErr w:type="spellEnd"/>
     </w:p>
     <w:p>
       <w:pPr>
@@ -687,8 +979,17 @@
           <w:sz w:val="20"/>
           <w:szCs w:val="20"/>
         </w:rPr>
-        <w:t>import-open-sales-orders.mjs</w:t>
-      </w:r>
+        <w:t>import-open-sales-</w:t>
+      </w:r>
+      <w:proofErr w:type="spellStart"/>
+      <w:r>
+        <w:rPr>
+          <w:sz w:val="20"/>
+          <w:szCs w:val="20"/>
+        </w:rPr>
+        <w:t>orders.mjs</w:t>
+      </w:r>
+      <w:proofErr w:type="spellEnd"/>
     </w:p>
     <w:p>
       <w:pPr>
@@ -702,12 +1003,21 @@
           <w:szCs w:val="20"/>
         </w:rPr>
       </w:pPr>
-      <w:r>
-        <w:rPr>
-          <w:sz w:val="20"/>
-          <w:szCs w:val="20"/>
-        </w:rPr>
-        <w:t>Imports all open Sales orders</w:t>
+      <w:proofErr w:type="gramStart"/>
+      <w:r>
+        <w:rPr>
+          <w:sz w:val="20"/>
+          <w:szCs w:val="20"/>
+        </w:rPr>
+        <w:t>Imports</w:t>
+      </w:r>
+      <w:proofErr w:type="gramEnd"/>
+      <w:r>
+        <w:rPr>
+          <w:sz w:val="20"/>
+          <w:szCs w:val="20"/>
+        </w:rPr>
+        <w:t xml:space="preserve"> all open Sales orders</w:t>
       </w:r>
     </w:p>
     <w:p>
@@ -722,6 +1032,7 @@
           <w:szCs w:val="20"/>
         </w:rPr>
       </w:pPr>
+      <w:proofErr w:type="spellStart"/>
       <w:r>
         <w:rPr>
           <w:sz w:val="20"/>
@@ -729,6 +1040,7 @@
         </w:rPr>
         <w:t>importCustomersWithBuyerEmail.mjs</w:t>
       </w:r>
+      <w:proofErr w:type="spellEnd"/>
     </w:p>
     <w:p>
       <w:pPr>
@@ -742,12 +1054,21 @@
           <w:szCs w:val="20"/>
         </w:rPr>
       </w:pPr>
-      <w:r>
-        <w:rPr>
-          <w:sz w:val="20"/>
-          <w:szCs w:val="20"/>
-        </w:rPr>
-        <w:t>Imports all buyer contacts for each store with buyer email</w:t>
+      <w:proofErr w:type="gramStart"/>
+      <w:r>
+        <w:rPr>
+          <w:sz w:val="20"/>
+          <w:szCs w:val="20"/>
+        </w:rPr>
+        <w:t>Imports</w:t>
+      </w:r>
+      <w:proofErr w:type="gramEnd"/>
+      <w:r>
+        <w:rPr>
+          <w:sz w:val="20"/>
+          <w:szCs w:val="20"/>
+        </w:rPr>
+        <w:t xml:space="preserve"> all buyer contacts for each store with buyer email</w:t>
       </w:r>
     </w:p>
     <w:p>
@@ -767,8 +1088,17 @@
           <w:sz w:val="20"/>
           <w:szCs w:val="20"/>
         </w:rPr>
-        <w:t>import-customers.mjs</w:t>
-      </w:r>
+        <w:t>import-</w:t>
+      </w:r>
+      <w:proofErr w:type="spellStart"/>
+      <w:r>
+        <w:rPr>
+          <w:sz w:val="20"/>
+          <w:szCs w:val="20"/>
+        </w:rPr>
+        <w:t>customers.mjs</w:t>
+      </w:r>
+      <w:proofErr w:type="spellEnd"/>
     </w:p>
     <w:p>
       <w:pPr>
@@ -782,12 +1112,21 @@
           <w:szCs w:val="20"/>
         </w:rPr>
       </w:pPr>
-      <w:r>
-        <w:rPr>
-          <w:sz w:val="20"/>
-          <w:szCs w:val="20"/>
-        </w:rPr>
-        <w:t>Imports all customers</w:t>
+      <w:proofErr w:type="gramStart"/>
+      <w:r>
+        <w:rPr>
+          <w:sz w:val="20"/>
+          <w:szCs w:val="20"/>
+        </w:rPr>
+        <w:t>Imports</w:t>
+      </w:r>
+      <w:proofErr w:type="gramEnd"/>
+      <w:r>
+        <w:rPr>
+          <w:sz w:val="20"/>
+          <w:szCs w:val="20"/>
+        </w:rPr>
+        <w:t xml:space="preserve"> all customers</w:t>
       </w:r>
     </w:p>
     <w:p>
@@ -827,7 +1166,25 @@
           <w:sz w:val="20"/>
           <w:szCs w:val="20"/>
         </w:rPr>
-        <w:t>Calculates the best selling items in the last 60 days</w:t>
+        <w:t xml:space="preserve">Calculates the </w:t>
+      </w:r>
+      <w:proofErr w:type="spellStart"/>
+      <w:proofErr w:type="gramStart"/>
+      <w:r>
+        <w:rPr>
+          <w:sz w:val="20"/>
+          <w:szCs w:val="20"/>
+        </w:rPr>
+        <w:t>best selling</w:t>
+      </w:r>
+      <w:proofErr w:type="spellEnd"/>
+      <w:proofErr w:type="gramEnd"/>
+      <w:r>
+        <w:rPr>
+          <w:sz w:val="20"/>
+          <w:szCs w:val="20"/>
+        </w:rPr>
+        <w:t xml:space="preserve"> items in the last 60 days</w:t>
       </w:r>
     </w:p>
     <w:p>
@@ -842,13 +1199,22 @@
           <w:szCs w:val="20"/>
         </w:rPr>
       </w:pPr>
-      <w:r>
-        <w:rPr>
-          <w:sz w:val="20"/>
-          <w:szCs w:val="20"/>
-        </w:rPr>
-        <w:t>Build_item_customer_index.mjs</w:t>
-      </w:r>
+      <w:proofErr w:type="spellStart"/>
+      <w:r>
+        <w:rPr>
+          <w:sz w:val="20"/>
+          <w:szCs w:val="20"/>
+        </w:rPr>
+        <w:t>b</w:t>
+      </w:r>
+      <w:r>
+        <w:rPr>
+          <w:sz w:val="20"/>
+          <w:szCs w:val="20"/>
+        </w:rPr>
+        <w:t>uild_item_customer_index.mjs</w:t>
+      </w:r>
+      <w:proofErr w:type="spellEnd"/>
     </w:p>
     <w:p>
       <w:pPr>
@@ -868,6 +1234,55 @@
           <w:szCs w:val="20"/>
         </w:rPr>
         <w:t>Builds the logic to show which customer bought Items</w:t>
+      </w:r>
+    </w:p>
+    <w:p>
+      <w:pPr>
+        <w:pStyle w:val="ListParagraph"/>
+        <w:numPr>
+          <w:ilvl w:val="0"/>
+          <w:numId w:val="1"/>
+        </w:numPr>
+        <w:rPr>
+          <w:sz w:val="20"/>
+          <w:szCs w:val="20"/>
+        </w:rPr>
+      </w:pPr>
+      <w:r>
+        <w:rPr>
+          <w:sz w:val="20"/>
+          <w:szCs w:val="20"/>
+        </w:rPr>
+        <w:t>import-items-</w:t>
+      </w:r>
+      <w:proofErr w:type="spellStart"/>
+      <w:r>
+        <w:rPr>
+          <w:sz w:val="20"/>
+          <w:szCs w:val="20"/>
+        </w:rPr>
+        <w:t>master.mjs</w:t>
+      </w:r>
+      <w:proofErr w:type="spellEnd"/>
+    </w:p>
+    <w:p>
+      <w:pPr>
+        <w:pStyle w:val="ListParagraph"/>
+        <w:numPr>
+          <w:ilvl w:val="1"/>
+          <w:numId w:val="1"/>
+        </w:numPr>
+        <w:rPr>
+          <w:sz w:val="20"/>
+          <w:szCs w:val="20"/>
+        </w:rPr>
+      </w:pPr>
+      <w:r>
+        <w:rPr>
+          <w:sz w:val="20"/>
+          <w:szCs w:val="20"/>
+        </w:rPr>
+        <w:t>Imports all items that are NOV, FOOD, EYE, CELL and active</w:t>
       </w:r>
     </w:p>
     <w:sectPr>

</xml_diff>

<commit_message>
Fix invoice import streaming + UI updates
</commit_message>
<xml_diff>
--- a/Tasks to make ET Products Internal Portal Functional.docx
+++ b/Tasks to make ET Products Internal Portal Functional.docx
@@ -74,23 +74,7 @@
           <w:szCs w:val="20"/>
         </w:rPr>
         <w:br/>
-        <w:t xml:space="preserve">      a. </w:t>
-      </w:r>
-      <w:proofErr w:type="gramStart"/>
-      <w:r>
-        <w:rPr>
-          <w:sz w:val="20"/>
-          <w:szCs w:val="20"/>
-        </w:rPr>
-        <w:t>Exports</w:t>
-      </w:r>
-      <w:proofErr w:type="gramEnd"/>
-      <w:r>
-        <w:rPr>
-          <w:sz w:val="20"/>
-          <w:szCs w:val="20"/>
-        </w:rPr>
-        <w:t xml:space="preserve"> all accounts from SAGE (21 fields)</w:t>
+        <w:t xml:space="preserve">      a. Exports all accounts from SAGE (21 fields)</w:t>
       </w:r>
     </w:p>
     <w:p>
@@ -107,45 +91,111 @@
         </w:rPr>
         <w:t>2</w:t>
       </w:r>
-      <w:proofErr w:type="gramStart"/>
-      <w:r>
-        <w:rPr>
-          <w:sz w:val="20"/>
-          <w:szCs w:val="20"/>
-        </w:rPr>
-        <w:t>.  SALES</w:t>
-      </w:r>
-      <w:proofErr w:type="gramEnd"/>
-      <w:r>
-        <w:rPr>
-          <w:sz w:val="20"/>
-          <w:szCs w:val="20"/>
-        </w:rPr>
-        <w:t>_CUST_CON</w:t>
-      </w:r>
-      <w:r>
-        <w:rPr>
-          <w:sz w:val="20"/>
-          <w:szCs w:val="20"/>
-        </w:rPr>
-        <w:br/>
-        <w:t xml:space="preserve">      a. Exports any </w:t>
-      </w:r>
-      <w:proofErr w:type="gramStart"/>
-      <w:r>
-        <w:rPr>
-          <w:sz w:val="20"/>
-          <w:szCs w:val="20"/>
-        </w:rPr>
-        <w:t>buyers</w:t>
-      </w:r>
-      <w:proofErr w:type="gramEnd"/>
-      <w:r>
-        <w:rPr>
-          <w:sz w:val="20"/>
-          <w:szCs w:val="20"/>
-        </w:rPr>
-        <w:t xml:space="preserve"> customers from Sage.</w:t>
+      <w:r>
+        <w:rPr>
+          <w:sz w:val="20"/>
+          <w:szCs w:val="20"/>
+        </w:rPr>
+        <w:t>.  SALES_CUST_CON</w:t>
+      </w:r>
+      <w:r>
+        <w:rPr>
+          <w:sz w:val="20"/>
+          <w:szCs w:val="20"/>
+        </w:rPr>
+        <w:br/>
+        <w:t xml:space="preserve">      a. Exports any buyers customers from Sage.</w:t>
+      </w:r>
+      <w:r>
+        <w:rPr>
+          <w:sz w:val="20"/>
+          <w:szCs w:val="20"/>
+        </w:rPr>
+        <w:br/>
+        <w:t xml:space="preserve">           1. CustomerNo</w:t>
+      </w:r>
+      <w:r>
+        <w:rPr>
+          <w:sz w:val="20"/>
+          <w:szCs w:val="20"/>
+        </w:rPr>
+        <w:br/>
+        <w:t xml:space="preserve">           2. ContactCode</w:t>
+      </w:r>
+      <w:r>
+        <w:rPr>
+          <w:sz w:val="20"/>
+          <w:szCs w:val="20"/>
+        </w:rPr>
+        <w:br/>
+        <w:t xml:space="preserve">           3. ContactName</w:t>
+      </w:r>
+      <w:r>
+        <w:rPr>
+          <w:sz w:val="20"/>
+          <w:szCs w:val="20"/>
+        </w:rPr>
+        <w:br/>
+        <w:t xml:space="preserve">           4.  EmailAddress</w:t>
+      </w:r>
+      <w:r>
+        <w:rPr>
+          <w:sz w:val="20"/>
+          <w:szCs w:val="20"/>
+        </w:rPr>
+        <w:br/>
+      </w:r>
+      <w:r>
+        <w:rPr>
+          <w:sz w:val="20"/>
+          <w:szCs w:val="20"/>
+        </w:rPr>
+        <w:br/>
+        <w:t>3</w:t>
+      </w:r>
+      <w:r>
+        <w:rPr>
+          <w:sz w:val="20"/>
+          <w:szCs w:val="20"/>
+        </w:rPr>
+        <w:t>.  SALES_INV_HH</w:t>
+      </w:r>
+      <w:r>
+        <w:rPr>
+          <w:sz w:val="20"/>
+          <w:szCs w:val="20"/>
+        </w:rPr>
+        <w:br/>
+      </w:r>
+      <w:r>
+        <w:rPr>
+          <w:sz w:val="20"/>
+          <w:szCs w:val="20"/>
+        </w:rPr>
+        <w:br/>
+        <w:t>4</w:t>
+      </w:r>
+      <w:r>
+        <w:rPr>
+          <w:sz w:val="20"/>
+          <w:szCs w:val="20"/>
+        </w:rPr>
+        <w:t>.  SALES_INV_IH</w:t>
+      </w:r>
+      <w:r>
+        <w:rPr>
+          <w:sz w:val="20"/>
+          <w:szCs w:val="20"/>
+        </w:rPr>
+        <w:t>D</w:t>
+      </w:r>
+      <w:r>
+        <w:rPr>
+          <w:sz w:val="20"/>
+          <w:szCs w:val="20"/>
+        </w:rPr>
+        <w:br/>
+        <w:t xml:space="preserve">     a. Exports all invoice detail from Sage</w:t>
       </w:r>
       <w:r>
         <w:rPr>
@@ -155,15 +205,13 @@
         <w:br/>
         <w:t xml:space="preserve">           1. </w:t>
       </w:r>
-      <w:proofErr w:type="spellStart"/>
-      <w:r>
-        <w:rPr>
-          <w:sz w:val="20"/>
-          <w:szCs w:val="20"/>
-        </w:rPr>
-        <w:t>CustomerNo</w:t>
-      </w:r>
-      <w:proofErr w:type="spellEnd"/>
+      <w:r>
+        <w:rPr>
+          <w:sz w:val="20"/>
+          <w:szCs w:val="20"/>
+        </w:rPr>
+        <w:t>InvoiceNo</w:t>
+      </w:r>
       <w:r>
         <w:rPr>
           <w:sz w:val="20"/>
@@ -172,15 +220,13 @@
         <w:br/>
         <w:t xml:space="preserve">           2. </w:t>
       </w:r>
-      <w:proofErr w:type="spellStart"/>
-      <w:r>
-        <w:rPr>
-          <w:sz w:val="20"/>
-          <w:szCs w:val="20"/>
-        </w:rPr>
-        <w:t>ContactCode</w:t>
-      </w:r>
-      <w:proofErr w:type="spellEnd"/>
+      <w:r>
+        <w:rPr>
+          <w:sz w:val="20"/>
+          <w:szCs w:val="20"/>
+        </w:rPr>
+        <w:t>ItemCode</w:t>
+      </w:r>
       <w:r>
         <w:rPr>
           <w:sz w:val="20"/>
@@ -189,150 +235,6 @@
         <w:br/>
         <w:t xml:space="preserve">           3. </w:t>
       </w:r>
-      <w:proofErr w:type="spellStart"/>
-      <w:r>
-        <w:rPr>
-          <w:sz w:val="20"/>
-          <w:szCs w:val="20"/>
-        </w:rPr>
-        <w:t>ContactName</w:t>
-      </w:r>
-      <w:proofErr w:type="spellEnd"/>
-      <w:r>
-        <w:rPr>
-          <w:sz w:val="20"/>
-          <w:szCs w:val="20"/>
-        </w:rPr>
-        <w:br/>
-        <w:t xml:space="preserve">           4.  </w:t>
-      </w:r>
-      <w:proofErr w:type="spellStart"/>
-      <w:r>
-        <w:rPr>
-          <w:sz w:val="20"/>
-          <w:szCs w:val="20"/>
-        </w:rPr>
-        <w:t>EmailAddress</w:t>
-      </w:r>
-      <w:proofErr w:type="spellEnd"/>
-      <w:r>
-        <w:rPr>
-          <w:sz w:val="20"/>
-          <w:szCs w:val="20"/>
-        </w:rPr>
-        <w:br/>
-      </w:r>
-      <w:r>
-        <w:rPr>
-          <w:sz w:val="20"/>
-          <w:szCs w:val="20"/>
-        </w:rPr>
-        <w:br/>
-        <w:t>3</w:t>
-      </w:r>
-      <w:r>
-        <w:rPr>
-          <w:sz w:val="20"/>
-          <w:szCs w:val="20"/>
-        </w:rPr>
-        <w:t>.  SALES_INV_HH</w:t>
-      </w:r>
-      <w:r>
-        <w:rPr>
-          <w:sz w:val="20"/>
-          <w:szCs w:val="20"/>
-        </w:rPr>
-        <w:br/>
-      </w:r>
-      <w:r>
-        <w:rPr>
-          <w:sz w:val="20"/>
-          <w:szCs w:val="20"/>
-        </w:rPr>
-        <w:br/>
-        <w:t>4</w:t>
-      </w:r>
-      <w:r>
-        <w:rPr>
-          <w:sz w:val="20"/>
-          <w:szCs w:val="20"/>
-        </w:rPr>
-        <w:t>.  SALES_INV_IH</w:t>
-      </w:r>
-      <w:r>
-        <w:rPr>
-          <w:sz w:val="20"/>
-          <w:szCs w:val="20"/>
-        </w:rPr>
-        <w:t>D</w:t>
-      </w:r>
-      <w:r>
-        <w:rPr>
-          <w:sz w:val="20"/>
-          <w:szCs w:val="20"/>
-        </w:rPr>
-        <w:br/>
-        <w:t xml:space="preserve">     a. Exports all invoice </w:t>
-      </w:r>
-      <w:proofErr w:type="gramStart"/>
-      <w:r>
-        <w:rPr>
-          <w:sz w:val="20"/>
-          <w:szCs w:val="20"/>
-        </w:rPr>
-        <w:t>detail</w:t>
-      </w:r>
-      <w:proofErr w:type="gramEnd"/>
-      <w:r>
-        <w:rPr>
-          <w:sz w:val="20"/>
-          <w:szCs w:val="20"/>
-        </w:rPr>
-        <w:t xml:space="preserve"> from Sage</w:t>
-      </w:r>
-      <w:r>
-        <w:rPr>
-          <w:sz w:val="20"/>
-          <w:szCs w:val="20"/>
-        </w:rPr>
-        <w:br/>
-        <w:t xml:space="preserve">           1. </w:t>
-      </w:r>
-      <w:proofErr w:type="spellStart"/>
-      <w:r>
-        <w:rPr>
-          <w:sz w:val="20"/>
-          <w:szCs w:val="20"/>
-        </w:rPr>
-        <w:t>InvoiceNo</w:t>
-      </w:r>
-      <w:proofErr w:type="spellEnd"/>
-      <w:r>
-        <w:rPr>
-          <w:sz w:val="20"/>
-          <w:szCs w:val="20"/>
-        </w:rPr>
-        <w:br/>
-        <w:t xml:space="preserve">           2. </w:t>
-      </w:r>
-      <w:proofErr w:type="spellStart"/>
-      <w:r>
-        <w:rPr>
-          <w:sz w:val="20"/>
-          <w:szCs w:val="20"/>
-        </w:rPr>
-        <w:t>ItemCode</w:t>
-      </w:r>
-      <w:proofErr w:type="spellEnd"/>
-      <w:r>
-        <w:rPr>
-          <w:sz w:val="20"/>
-          <w:szCs w:val="20"/>
-        </w:rPr>
-        <w:br/>
-        <w:t xml:space="preserve">           3. </w:t>
-      </w:r>
-      <w:proofErr w:type="spellStart"/>
       <w:r>
         <w:rPr>
           <w:sz w:val="20"/>
@@ -340,7 +242,6 @@
         </w:rPr>
         <w:t>ItemCodeDesc</w:t>
       </w:r>
-      <w:proofErr w:type="spellEnd"/>
       <w:r>
         <w:rPr>
           <w:sz w:val="20"/>
@@ -349,7 +250,6 @@
         <w:br/>
         <w:t xml:space="preserve">           4. </w:t>
       </w:r>
-      <w:proofErr w:type="spellStart"/>
       <w:r>
         <w:rPr>
           <w:sz w:val="20"/>
@@ -357,7 +257,6 @@
         </w:rPr>
         <w:t>QuantityShiped</w:t>
       </w:r>
-      <w:proofErr w:type="spellEnd"/>
       <w:r>
         <w:rPr>
           <w:sz w:val="20"/>
@@ -381,7 +280,6 @@
         <w:br/>
         <w:t xml:space="preserve">           6. </w:t>
       </w:r>
-      <w:proofErr w:type="spellStart"/>
       <w:r>
         <w:rPr>
           <w:sz w:val="20"/>
@@ -389,7 +287,6 @@
         </w:rPr>
         <w:t>ProductLine</w:t>
       </w:r>
-      <w:proofErr w:type="spellEnd"/>
       <w:r>
         <w:rPr>
           <w:sz w:val="20"/>
@@ -398,7 +295,6 @@
         <w:br/>
         <w:t xml:space="preserve">           7. </w:t>
       </w:r>
-      <w:proofErr w:type="spellStart"/>
       <w:r>
         <w:rPr>
           <w:sz w:val="20"/>
@@ -406,7 +302,6 @@
         </w:rPr>
         <w:t>AliasItemNo</w:t>
       </w:r>
-      <w:proofErr w:type="spellEnd"/>
       <w:r>
         <w:rPr>
           <w:sz w:val="20"/>
@@ -420,17 +315,8 @@
           <w:sz w:val="20"/>
           <w:szCs w:val="20"/>
         </w:rPr>
-        <w:t xml:space="preserve"> </w:t>
-      </w:r>
-      <w:proofErr w:type="spellStart"/>
-      <w:r>
-        <w:rPr>
-          <w:sz w:val="20"/>
-          <w:szCs w:val="20"/>
-        </w:rPr>
-        <w:t>CommentText</w:t>
-      </w:r>
-      <w:proofErr w:type="spellEnd"/>
+        <w:t xml:space="preserve"> CommentText</w:t>
+      </w:r>
       <w:r>
         <w:rPr>
           <w:sz w:val="20"/>
@@ -439,7 +325,6 @@
         <w:br/>
         <w:t xml:space="preserve">           9. </w:t>
       </w:r>
-      <w:proofErr w:type="spellStart"/>
       <w:r>
         <w:rPr>
           <w:sz w:val="20"/>
@@ -447,7 +332,6 @@
         </w:rPr>
         <w:t>UnitPrice</w:t>
       </w:r>
-      <w:proofErr w:type="spellEnd"/>
       <w:r>
         <w:rPr>
           <w:sz w:val="20"/>
@@ -456,7 +340,6 @@
         <w:br/>
         <w:t xml:space="preserve">           10. </w:t>
       </w:r>
-      <w:proofErr w:type="spellStart"/>
       <w:r>
         <w:rPr>
           <w:sz w:val="20"/>
@@ -464,7 +347,6 @@
         </w:rPr>
         <w:t>ExtensionAmt</w:t>
       </w:r>
-      <w:proofErr w:type="spellEnd"/>
       <w:r>
         <w:rPr>
           <w:sz w:val="20"/>
@@ -473,7 +355,6 @@
         <w:br/>
         <w:t xml:space="preserve">           11. </w:t>
       </w:r>
-      <w:proofErr w:type="spellStart"/>
       <w:r>
         <w:rPr>
           <w:sz w:val="20"/>
@@ -481,7 +362,6 @@
         </w:rPr>
         <w:t>WarehouseCode</w:t>
       </w:r>
-      <w:proofErr w:type="spellEnd"/>
       <w:r>
         <w:rPr>
           <w:sz w:val="20"/>
@@ -490,7 +370,6 @@
         <w:br/>
         <w:t xml:space="preserve">           12. </w:t>
       </w:r>
-      <w:proofErr w:type="spellStart"/>
       <w:r>
         <w:rPr>
           <w:sz w:val="20"/>
@@ -498,7 +377,6 @@
         </w:rPr>
         <w:t>SalesAcctKey</w:t>
       </w:r>
-      <w:proofErr w:type="spellEnd"/>
       <w:r>
         <w:rPr>
           <w:sz w:val="20"/>
@@ -535,34 +413,16 @@
           <w:szCs w:val="20"/>
         </w:rPr>
         <w:br/>
-        <w:t xml:space="preserve">           1. </w:t>
-      </w:r>
-      <w:proofErr w:type="spellStart"/>
-      <w:r>
-        <w:rPr>
-          <w:sz w:val="20"/>
-          <w:szCs w:val="20"/>
-        </w:rPr>
-        <w:t>SalesOderNo</w:t>
-      </w:r>
-      <w:proofErr w:type="spellEnd"/>
-      <w:r>
-        <w:rPr>
-          <w:sz w:val="20"/>
-          <w:szCs w:val="20"/>
-        </w:rPr>
-        <w:br/>
-        <w:t xml:space="preserve">           2. </w:t>
-      </w:r>
-      <w:proofErr w:type="spellStart"/>
-      <w:r>
-        <w:rPr>
-          <w:sz w:val="20"/>
-          <w:szCs w:val="20"/>
-        </w:rPr>
-        <w:t>OrderDate</w:t>
-      </w:r>
-      <w:proofErr w:type="spellEnd"/>
+        <w:t xml:space="preserve">           1. SalesOderNo</w:t>
+      </w:r>
+      <w:r>
+        <w:rPr>
+          <w:sz w:val="20"/>
+          <w:szCs w:val="20"/>
+        </w:rPr>
+        <w:br/>
+        <w:t xml:space="preserve">           2. OrderDate</w:t>
+      </w:r>
       <w:r>
         <w:rPr>
           <w:sz w:val="20"/>
@@ -577,51 +437,24 @@
           <w:szCs w:val="20"/>
         </w:rPr>
         <w:br/>
-        <w:t xml:space="preserve">           4. </w:t>
-      </w:r>
-      <w:proofErr w:type="spellStart"/>
-      <w:r>
-        <w:rPr>
-          <w:sz w:val="20"/>
-          <w:szCs w:val="20"/>
-        </w:rPr>
-        <w:t>SalespersonNo</w:t>
-      </w:r>
-      <w:proofErr w:type="spellEnd"/>
-      <w:r>
-        <w:rPr>
-          <w:sz w:val="20"/>
-          <w:szCs w:val="20"/>
-        </w:rPr>
-        <w:br/>
-        <w:t xml:space="preserve">           5. </w:t>
-      </w:r>
-      <w:proofErr w:type="spellStart"/>
-      <w:r>
-        <w:rPr>
-          <w:sz w:val="20"/>
-          <w:szCs w:val="20"/>
-        </w:rPr>
-        <w:t>CustomerNo</w:t>
-      </w:r>
-      <w:proofErr w:type="spellEnd"/>
-      <w:r>
-        <w:rPr>
-          <w:sz w:val="20"/>
-          <w:szCs w:val="20"/>
-        </w:rPr>
-        <w:br/>
-        <w:t xml:space="preserve">           6. </w:t>
-      </w:r>
-      <w:proofErr w:type="spellStart"/>
-      <w:r>
-        <w:rPr>
-          <w:sz w:val="20"/>
-          <w:szCs w:val="20"/>
-        </w:rPr>
-        <w:t>ShipToName</w:t>
-      </w:r>
-      <w:proofErr w:type="spellEnd"/>
+        <w:t xml:space="preserve">           4. SalespersonNo</w:t>
+      </w:r>
+      <w:r>
+        <w:rPr>
+          <w:sz w:val="20"/>
+          <w:szCs w:val="20"/>
+        </w:rPr>
+        <w:br/>
+        <w:t xml:space="preserve">           5. CustomerNo</w:t>
+      </w:r>
+      <w:r>
+        <w:rPr>
+          <w:sz w:val="20"/>
+          <w:szCs w:val="20"/>
+        </w:rPr>
+        <w:br/>
+        <w:t xml:space="preserve">           6. ShipToName</w:t>
+      </w:r>
       <w:r>
         <w:rPr>
           <w:sz w:val="20"/>
@@ -636,102 +469,48 @@
           <w:szCs w:val="20"/>
         </w:rPr>
         <w:br/>
-        <w:t xml:space="preserve">           8. </w:t>
-      </w:r>
-      <w:proofErr w:type="spellStart"/>
-      <w:r>
-        <w:rPr>
-          <w:sz w:val="20"/>
-          <w:szCs w:val="20"/>
-        </w:rPr>
-        <w:t>ShipToCity</w:t>
-      </w:r>
-      <w:proofErr w:type="spellEnd"/>
-      <w:r>
-        <w:rPr>
-          <w:sz w:val="20"/>
-          <w:szCs w:val="20"/>
-        </w:rPr>
-        <w:br/>
-        <w:t xml:space="preserve">           9. </w:t>
-      </w:r>
-      <w:proofErr w:type="spellStart"/>
-      <w:r>
-        <w:rPr>
-          <w:sz w:val="20"/>
-          <w:szCs w:val="20"/>
-        </w:rPr>
-        <w:t>ShipToState</w:t>
-      </w:r>
-      <w:proofErr w:type="spellEnd"/>
-      <w:r>
-        <w:rPr>
-          <w:sz w:val="20"/>
-          <w:szCs w:val="20"/>
-        </w:rPr>
-        <w:br/>
-        <w:t xml:space="preserve">           10. </w:t>
-      </w:r>
-      <w:proofErr w:type="spellStart"/>
-      <w:r>
-        <w:rPr>
-          <w:sz w:val="20"/>
-          <w:szCs w:val="20"/>
-        </w:rPr>
-        <w:t>ShipToZipCode</w:t>
-      </w:r>
-      <w:proofErr w:type="spellEnd"/>
-      <w:r>
-        <w:rPr>
-          <w:sz w:val="20"/>
-          <w:szCs w:val="20"/>
-        </w:rPr>
-        <w:br/>
-        <w:t xml:space="preserve">           11. </w:t>
-      </w:r>
-      <w:proofErr w:type="spellStart"/>
-      <w:r>
-        <w:rPr>
-          <w:sz w:val="20"/>
-          <w:szCs w:val="20"/>
-        </w:rPr>
-        <w:t>ItemCode</w:t>
-      </w:r>
-      <w:proofErr w:type="spellEnd"/>
-      <w:r>
-        <w:rPr>
-          <w:sz w:val="20"/>
-          <w:szCs w:val="20"/>
-        </w:rPr>
-        <w:br/>
-        <w:t xml:space="preserve">           12. </w:t>
-      </w:r>
-      <w:proofErr w:type="spellStart"/>
-      <w:r>
-        <w:rPr>
-          <w:sz w:val="20"/>
-          <w:szCs w:val="20"/>
-        </w:rPr>
-        <w:t>ItemCodeDesc</w:t>
-      </w:r>
-      <w:proofErr w:type="spellEnd"/>
-      <w:r>
-        <w:rPr>
-          <w:sz w:val="20"/>
-          <w:szCs w:val="20"/>
-        </w:rPr>
-        <w:br/>
-        <w:t xml:space="preserve">           13. </w:t>
-      </w:r>
-      <w:proofErr w:type="spellStart"/>
-      <w:r>
-        <w:rPr>
-          <w:sz w:val="20"/>
-          <w:szCs w:val="20"/>
-        </w:rPr>
-        <w:t>QuantityOrdered</w:t>
-      </w:r>
-      <w:proofErr w:type="spellEnd"/>
+        <w:t xml:space="preserve">           8. ShipToCity</w:t>
+      </w:r>
+      <w:r>
+        <w:rPr>
+          <w:sz w:val="20"/>
+          <w:szCs w:val="20"/>
+        </w:rPr>
+        <w:br/>
+        <w:t xml:space="preserve">           9. ShipToState</w:t>
+      </w:r>
+      <w:r>
+        <w:rPr>
+          <w:sz w:val="20"/>
+          <w:szCs w:val="20"/>
+        </w:rPr>
+        <w:br/>
+        <w:t xml:space="preserve">           10. ShipToZipCode</w:t>
+      </w:r>
+      <w:r>
+        <w:rPr>
+          <w:sz w:val="20"/>
+          <w:szCs w:val="20"/>
+        </w:rPr>
+        <w:br/>
+        <w:t xml:space="preserve">           11. ItemCode</w:t>
+      </w:r>
+      <w:r>
+        <w:rPr>
+          <w:sz w:val="20"/>
+          <w:szCs w:val="20"/>
+        </w:rPr>
+        <w:br/>
+        <w:t xml:space="preserve">           12. ItemCodeDesc</w:t>
+      </w:r>
+      <w:r>
+        <w:rPr>
+          <w:sz w:val="20"/>
+          <w:szCs w:val="20"/>
+        </w:rPr>
+        <w:br/>
+        <w:t xml:space="preserve">           13. QuantityOrdered</w:t>
+      </w:r>
     </w:p>
     <w:p>
       <w:pPr>
@@ -746,40 +525,15 @@
           <w:szCs w:val="20"/>
         </w:rPr>
         <w:lastRenderedPageBreak/>
-        <w:t xml:space="preserve">6. </w:t>
-      </w:r>
-      <w:proofErr w:type="spellStart"/>
-      <w:r>
-        <w:rPr>
-          <w:sz w:val="20"/>
-          <w:szCs w:val="20"/>
-        </w:rPr>
-        <w:t>SALES_Item</w:t>
-      </w:r>
-      <w:proofErr w:type="spellEnd"/>
-      <w:r>
-        <w:rPr>
-          <w:sz w:val="20"/>
-          <w:szCs w:val="20"/>
-        </w:rPr>
-        <w:br/>
-        <w:t xml:space="preserve">    a. </w:t>
-      </w:r>
-      <w:proofErr w:type="gramStart"/>
-      <w:r>
-        <w:rPr>
-          <w:sz w:val="20"/>
-          <w:szCs w:val="20"/>
-        </w:rPr>
-        <w:t>Exports</w:t>
-      </w:r>
-      <w:proofErr w:type="gramEnd"/>
-      <w:r>
-        <w:rPr>
-          <w:sz w:val="20"/>
-          <w:szCs w:val="20"/>
-        </w:rPr>
-        <w:t xml:space="preserve"> all items </w:t>
+        <w:t>6. SALES_Item</w:t>
+      </w:r>
+      <w:r>
+        <w:rPr>
+          <w:sz w:val="20"/>
+          <w:szCs w:val="20"/>
+        </w:rPr>
+        <w:br/>
+        <w:t xml:space="preserve">    a. Exports all items </w:t>
       </w:r>
     </w:p>
     <w:p>
@@ -800,20 +554,8 @@
           <w:szCs w:val="20"/>
           <w:u w:val="single"/>
         </w:rPr>
-        <w:t xml:space="preserve">Scripts that need </w:t>
-      </w:r>
-      <w:proofErr w:type="gramStart"/>
-      <w:r>
-        <w:rPr>
-          <w:b/>
-          <w:bCs/>
-          <w:sz w:val="20"/>
-          <w:szCs w:val="20"/>
-          <w:u w:val="single"/>
-        </w:rPr>
-        <w:t>ran</w:t>
-      </w:r>
-      <w:proofErr w:type="gramEnd"/>
+        <w:t>Scripts that need ran</w:t>
+      </w:r>
     </w:p>
     <w:p>
       <w:pPr>
@@ -861,7 +603,21 @@
           <w:sz w:val="20"/>
           <w:szCs w:val="20"/>
         </w:rPr>
-        <w:t>mport-invoice-last-3-years.mjs</w:t>
+        <w:t>mport-invoice</w:t>
+      </w:r>
+      <w:r>
+        <w:rPr>
+          <w:sz w:val="20"/>
+          <w:szCs w:val="20"/>
+        </w:rPr>
+        <w:t>s</w:t>
+      </w:r>
+      <w:r>
+        <w:rPr>
+          <w:sz w:val="20"/>
+          <w:szCs w:val="20"/>
+        </w:rPr>
+        <w:t>-last-3-years.mjs</w:t>
       </w:r>
     </w:p>
     <w:p>
@@ -876,21 +632,12 @@
           <w:szCs w:val="20"/>
         </w:rPr>
       </w:pPr>
-      <w:proofErr w:type="gramStart"/>
-      <w:r>
-        <w:rPr>
-          <w:sz w:val="20"/>
-          <w:szCs w:val="20"/>
-        </w:rPr>
-        <w:t>Imports</w:t>
-      </w:r>
-      <w:proofErr w:type="gramEnd"/>
-      <w:r>
-        <w:rPr>
-          <w:sz w:val="20"/>
-          <w:szCs w:val="20"/>
-        </w:rPr>
-        <w:t xml:space="preserve"> last three years of invoices from IHH</w:t>
+      <w:r>
+        <w:rPr>
+          <w:sz w:val="20"/>
+          <w:szCs w:val="20"/>
+        </w:rPr>
+        <w:t>Imports last three years of invoices from IHH</w:t>
       </w:r>
     </w:p>
     <w:p>
@@ -925,7 +672,6 @@
           <w:szCs w:val="20"/>
         </w:rPr>
       </w:pPr>
-      <w:proofErr w:type="spellStart"/>
       <w:r>
         <w:rPr>
           <w:sz w:val="20"/>
@@ -940,7 +686,6 @@
         </w:rPr>
         <w:t>ackfill_line_headers.mjs</w:t>
       </w:r>
-      <w:proofErr w:type="spellEnd"/>
     </w:p>
     <w:p>
       <w:pPr>
@@ -979,17 +724,8 @@
           <w:sz w:val="20"/>
           <w:szCs w:val="20"/>
         </w:rPr>
-        <w:t>import-open-sales-</w:t>
-      </w:r>
-      <w:proofErr w:type="spellStart"/>
-      <w:r>
-        <w:rPr>
-          <w:sz w:val="20"/>
-          <w:szCs w:val="20"/>
-        </w:rPr>
-        <w:t>orders.mjs</w:t>
-      </w:r>
-      <w:proofErr w:type="spellEnd"/>
+        <w:t>import-open-sales-orders.mjs</w:t>
+      </w:r>
     </w:p>
     <w:p>
       <w:pPr>
@@ -1003,21 +739,12 @@
           <w:szCs w:val="20"/>
         </w:rPr>
       </w:pPr>
-      <w:proofErr w:type="gramStart"/>
-      <w:r>
-        <w:rPr>
-          <w:sz w:val="20"/>
-          <w:szCs w:val="20"/>
-        </w:rPr>
-        <w:t>Imports</w:t>
-      </w:r>
-      <w:proofErr w:type="gramEnd"/>
-      <w:r>
-        <w:rPr>
-          <w:sz w:val="20"/>
-          <w:szCs w:val="20"/>
-        </w:rPr>
-        <w:t xml:space="preserve"> all open Sales orders</w:t>
+      <w:r>
+        <w:rPr>
+          <w:sz w:val="20"/>
+          <w:szCs w:val="20"/>
+        </w:rPr>
+        <w:t>Imports all open Sales orders</w:t>
       </w:r>
     </w:p>
     <w:p>
@@ -1032,7 +759,6 @@
           <w:szCs w:val="20"/>
         </w:rPr>
       </w:pPr>
-      <w:proofErr w:type="spellStart"/>
       <w:r>
         <w:rPr>
           <w:sz w:val="20"/>
@@ -1040,7 +766,6 @@
         </w:rPr>
         <w:t>importCustomersWithBuyerEmail.mjs</w:t>
       </w:r>
-      <w:proofErr w:type="spellEnd"/>
     </w:p>
     <w:p>
       <w:pPr>
@@ -1054,21 +779,12 @@
           <w:szCs w:val="20"/>
         </w:rPr>
       </w:pPr>
-      <w:proofErr w:type="gramStart"/>
-      <w:r>
-        <w:rPr>
-          <w:sz w:val="20"/>
-          <w:szCs w:val="20"/>
-        </w:rPr>
-        <w:t>Imports</w:t>
-      </w:r>
-      <w:proofErr w:type="gramEnd"/>
-      <w:r>
-        <w:rPr>
-          <w:sz w:val="20"/>
-          <w:szCs w:val="20"/>
-        </w:rPr>
-        <w:t xml:space="preserve"> all buyer contacts for each store with buyer email</w:t>
+      <w:r>
+        <w:rPr>
+          <w:sz w:val="20"/>
+          <w:szCs w:val="20"/>
+        </w:rPr>
+        <w:t>Imports all buyer contacts for each store with buyer email</w:t>
       </w:r>
     </w:p>
     <w:p>
@@ -1088,17 +804,8 @@
           <w:sz w:val="20"/>
           <w:szCs w:val="20"/>
         </w:rPr>
-        <w:t>import-</w:t>
-      </w:r>
-      <w:proofErr w:type="spellStart"/>
-      <w:r>
-        <w:rPr>
-          <w:sz w:val="20"/>
-          <w:szCs w:val="20"/>
-        </w:rPr>
-        <w:t>customers.mjs</w:t>
-      </w:r>
-      <w:proofErr w:type="spellEnd"/>
+        <w:t>import-customers.mjs</w:t>
+      </w:r>
     </w:p>
     <w:p>
       <w:pPr>
@@ -1112,21 +819,12 @@
           <w:szCs w:val="20"/>
         </w:rPr>
       </w:pPr>
-      <w:proofErr w:type="gramStart"/>
-      <w:r>
-        <w:rPr>
-          <w:sz w:val="20"/>
-          <w:szCs w:val="20"/>
-        </w:rPr>
-        <w:t>Imports</w:t>
-      </w:r>
-      <w:proofErr w:type="gramEnd"/>
-      <w:r>
-        <w:rPr>
-          <w:sz w:val="20"/>
-          <w:szCs w:val="20"/>
-        </w:rPr>
-        <w:t xml:space="preserve"> all customers</w:t>
+      <w:r>
+        <w:rPr>
+          <w:sz w:val="20"/>
+          <w:szCs w:val="20"/>
+        </w:rPr>
+        <w:t>Imports all customers</w:t>
       </w:r>
     </w:p>
     <w:p>
@@ -1166,25 +864,7 @@
           <w:sz w:val="20"/>
           <w:szCs w:val="20"/>
         </w:rPr>
-        <w:t xml:space="preserve">Calculates the </w:t>
-      </w:r>
-      <w:proofErr w:type="spellStart"/>
-      <w:proofErr w:type="gramStart"/>
-      <w:r>
-        <w:rPr>
-          <w:sz w:val="20"/>
-          <w:szCs w:val="20"/>
-        </w:rPr>
-        <w:t>best selling</w:t>
-      </w:r>
-      <w:proofErr w:type="spellEnd"/>
-      <w:proofErr w:type="gramEnd"/>
-      <w:r>
-        <w:rPr>
-          <w:sz w:val="20"/>
-          <w:szCs w:val="20"/>
-        </w:rPr>
-        <w:t xml:space="preserve"> items in the last 60 days</w:t>
+        <w:t>Calculates the best selling items in the last 60 days</w:t>
       </w:r>
     </w:p>
     <w:p>
@@ -1199,7 +879,6 @@
           <w:szCs w:val="20"/>
         </w:rPr>
       </w:pPr>
-      <w:proofErr w:type="spellStart"/>
       <w:r>
         <w:rPr>
           <w:sz w:val="20"/>
@@ -1214,7 +893,6 @@
         </w:rPr>
         <w:t>uild_item_customer_index.mjs</w:t>
       </w:r>
-      <w:proofErr w:type="spellEnd"/>
     </w:p>
     <w:p>
       <w:pPr>
@@ -1253,17 +931,8 @@
           <w:sz w:val="20"/>
           <w:szCs w:val="20"/>
         </w:rPr>
-        <w:t>import-items-</w:t>
-      </w:r>
-      <w:proofErr w:type="spellStart"/>
-      <w:r>
-        <w:rPr>
-          <w:sz w:val="20"/>
-          <w:szCs w:val="20"/>
-        </w:rPr>
-        <w:t>master.mjs</w:t>
-      </w:r>
-      <w:proofErr w:type="spellEnd"/>
+        <w:t>import-items-master.mjs</w:t>
+      </w:r>
     </w:p>
     <w:p>
       <w:pPr>

</xml_diff>